<commit_message>
Ajustes, CFA y .zip
</commit_message>
<xml_diff>
--- a/fuentes/CF3_DI.docx
+++ b/fuentes/CF3_DI.docx
@@ -6971,6 +6971,7 @@
         <w:tc>
           <w:tcPr>
             <w:tcW w:w="4981" w:type="dxa"/>
+            <w:tcMar/>
           </w:tcPr>
           <w:p>
             <w:pPr>
@@ -7143,6 +7144,7 @@
         <w:tc>
           <w:tcPr>
             <w:tcW w:w="4981" w:type="dxa"/>
+            <w:tcMar/>
           </w:tcPr>
           <w:p>
             <w:pPr>
@@ -7200,78 +7202,116 @@
           </w:p>
           <w:p>
             <w:pPr>
+              <w:pStyle w:val="Prrafodelista"/>
+              <w:numPr>
+                <w:ilvl w:val="0"/>
+                <w:numId w:val="43"/>
+              </w:numPr>
               <w:jc w:val="both"/>
               <w:rPr>
-                <w:sz w:val="20"/>
-              </w:rPr>
-            </w:pPr>
-            <w:r>
-              <w:rPr>
-                <w:sz w:val="20"/>
+                <w:sz w:val="22"/>
+                <w:szCs w:val="22"/>
+              </w:rPr>
+            </w:pPr>
+            <w:r>
+              <w:rPr>
+                <w:sz w:val="20"/>
+                <w:szCs w:val="20"/>
               </w:rPr>
               <w:t>En el centro delantero, medir hacia abajo entre 6 y 9 centímetros, según la profundidad deseada.</w:t>
             </w:r>
           </w:p>
           <w:p>
             <w:pPr>
+              <w:pStyle w:val="Prrafodelista"/>
+              <w:numPr>
+                <w:ilvl w:val="0"/>
+                <w:numId w:val="43"/>
+              </w:numPr>
               <w:jc w:val="both"/>
               <w:rPr>
-                <w:sz w:val="20"/>
-              </w:rPr>
-            </w:pPr>
-            <w:r>
-              <w:rPr>
-                <w:sz w:val="20"/>
+                <w:sz w:val="22"/>
+                <w:szCs w:val="22"/>
+              </w:rPr>
+            </w:pPr>
+            <w:r>
+              <w:rPr>
+                <w:sz w:val="20"/>
+                <w:szCs w:val="20"/>
               </w:rPr>
               <w:t>En la línea del hombro, medir hacia dentro entre 4 y 6 centímetros desde el cuello.</w:t>
             </w:r>
           </w:p>
           <w:p>
             <w:pPr>
+              <w:pStyle w:val="Prrafodelista"/>
+              <w:numPr>
+                <w:ilvl w:val="0"/>
+                <w:numId w:val="43"/>
+              </w:numPr>
               <w:jc w:val="both"/>
               <w:rPr>
-                <w:sz w:val="20"/>
-              </w:rPr>
-            </w:pPr>
-            <w:r>
-              <w:rPr>
-                <w:sz w:val="20"/>
+                <w:sz w:val="22"/>
+                <w:szCs w:val="22"/>
+              </w:rPr>
+            </w:pPr>
+            <w:r>
+              <w:rPr>
+                <w:sz w:val="20"/>
+                <w:szCs w:val="20"/>
               </w:rPr>
               <w:t>Unir estos dos puntos formando una línea horizontal, y luego trazar una línea recta vertical desde el punto más bajo hasta el centro delantero.</w:t>
             </w:r>
             <w:r>
-              <w:rPr>
-                <w:sz w:val="20"/>
-              </w:rPr>
               <w:br/>
             </w:r>
             <w:r>
               <w:rPr>
                 <w:sz w:val="20"/>
+                <w:szCs w:val="20"/>
               </w:rPr>
               <w:t>El resultado es un escote cuadrado, de líneas rectas y ángulos marcados.</w:t>
             </w:r>
-            <w:r>
-              <w:rPr>
-                <w:sz w:val="20"/>
-              </w:rPr>
-              <w:br/>
-            </w:r>
-            <w:r>
-              <w:rPr>
-                <w:sz w:val="20"/>
+          </w:p>
+          <w:p>
+            <w:pPr>
+              <w:pStyle w:val="Prrafodelista"/>
+              <w:ind w:left="720"/>
+              <w:jc w:val="both"/>
+              <w:rPr>
+                <w:sz w:val="20"/>
+                <w:szCs w:val="20"/>
+              </w:rPr>
+            </w:pPr>
+          </w:p>
+          <w:p>
+            <w:pPr>
+              <w:pStyle w:val="Prrafodelista"/>
+              <w:ind w:left="720"/>
+              <w:jc w:val="both"/>
+              <w:rPr>
+                <w:sz w:val="22"/>
+                <w:szCs w:val="22"/>
+              </w:rPr>
+            </w:pPr>
+            <w:r>
+              <w:rPr>
+                <w:sz w:val="20"/>
+                <w:szCs w:val="20"/>
               </w:rPr>
               <w:t xml:space="preserve">Nota: En la </w:t>
             </w:r>
             <w:r>
               <w:rPr>
                 <w:sz w:val="20"/>
+                <w:szCs w:val="20"/>
               </w:rPr>
               <w:t>figura</w:t>
             </w:r>
             <w:r>
               <w:rPr>
                 <w:sz w:val="20"/>
+                <w:szCs w:val="20"/>
               </w:rPr>
               <w:t>, este escote está marcado en línea roja en el lado izquierdo.</w:t>
             </w:r>
@@ -27282,6 +27322,118 @@
 
 <file path=word/numbering.xml><?xml version="1.0" encoding="utf-8"?>
 <w:numbering xmlns:wpc="http://schemas.microsoft.com/office/word/2010/wordprocessingCanvas" xmlns:cx="http://schemas.microsoft.com/office/drawing/2014/chartex" xmlns:cx1="http://schemas.microsoft.com/office/drawing/2015/9/8/chartex" xmlns:cx2="http://schemas.microsoft.com/office/drawing/2015/10/21/chartex" xmlns:cx3="http://schemas.microsoft.com/office/drawing/2016/5/9/chartex" xmlns:cx4="http://schemas.microsoft.com/office/drawing/2016/5/10/chartex" xmlns:cx5="http://schemas.microsoft.com/office/drawing/2016/5/11/chartex" xmlns:cx6="http://schemas.microsoft.com/office/drawing/2016/5/12/chartex" xmlns:cx7="http://schemas.microsoft.com/office/drawing/2016/5/13/chartex" xmlns:cx8="http://schemas.microsoft.com/office/drawing/2016/5/14/chartex" xmlns:mc="http://schemas.openxmlformats.org/markup-compatibility/2006" xmlns:aink="http://schemas.microsoft.com/office/drawing/2016/ink" xmlns:am3d="http://schemas.microsoft.com/office/drawing/2017/model3d" xmlns:o="urn:schemas-microsoft-com:office:office" xmlns:r="http://schemas.openxmlformats.org/officeDocument/2006/relationships" xmlns:m="http://schemas.openxmlformats.org/officeDocument/2006/math" xmlns:v="urn:schemas-microsoft-com:vml" xmlns:wp14="http://schemas.microsoft.com/office/word/2010/wordprocessingDrawing" xmlns:wp="http://schemas.openxmlformats.org/drawingml/2006/wordprocessingDrawing" xmlns:w10="urn:schemas-microsoft-com:office:word" xmlns:w="http://schemas.openxmlformats.org/wordprocessingml/2006/main" xmlns:w14="http://schemas.microsoft.com/office/word/2010/wordml" xmlns:w15="http://schemas.microsoft.com/office/word/2012/wordml" xmlns:w16cex="http://schemas.microsoft.com/office/word/2018/wordml/cex" xmlns:w16cid="http://schemas.microsoft.com/office/word/2016/wordml/cid" xmlns:w16="http://schemas.microsoft.com/office/word/2018/wordml" xmlns:w16sdtdh="http://schemas.microsoft.com/office/word/2020/wordml/sdtdatahash" xmlns:w16se="http://schemas.microsoft.com/office/word/2015/wordml/symex" xmlns:wpg="http://schemas.microsoft.com/office/word/2010/wordprocessingGroup" xmlns:wpi="http://schemas.microsoft.com/office/word/2010/wordprocessingInk" xmlns:wne="http://schemas.microsoft.com/office/word/2006/wordml" xmlns:wps="http://schemas.microsoft.com/office/word/2010/wordprocessingShape" mc:Ignorable="w14 w15 w16se w16cid w16 w16cex w16sdtdh wp14">
+  <w:abstractNum xmlns:w="http://schemas.openxmlformats.org/wordprocessingml/2006/main" w:abstractNumId="42">
+    <w:nsid w:val="71a7d252"/>
+    <w:multiLevelType xmlns:w="http://schemas.openxmlformats.org/wordprocessingml/2006/main" w:val="hybridMultilevel"/>
+    <w:lvl xmlns:w="http://schemas.openxmlformats.org/wordprocessingml/2006/main" w:ilvl="0">
+      <w:start w:val="1"/>
+      <w:numFmt w:val="bullet"/>
+      <w:lvlText w:val=""/>
+      <w:lvlJc w:val="left"/>
+      <w:pPr>
+        <w:ind w:left="720" w:hanging="360"/>
+      </w:pPr>
+      <w:rPr>
+        <w:rFonts w:hint="default" w:ascii="Symbol" w:hAnsi="Symbol"/>
+      </w:rPr>
+    </w:lvl>
+    <w:lvl xmlns:w="http://schemas.openxmlformats.org/wordprocessingml/2006/main" w:ilvl="1">
+      <w:start w:val="1"/>
+      <w:numFmt w:val="bullet"/>
+      <w:lvlText w:val="o"/>
+      <w:lvlJc w:val="left"/>
+      <w:pPr>
+        <w:ind w:left="1440" w:hanging="360"/>
+      </w:pPr>
+      <w:rPr>
+        <w:rFonts w:hint="default" w:ascii="Courier New" w:hAnsi="Courier New"/>
+      </w:rPr>
+    </w:lvl>
+    <w:lvl xmlns:w="http://schemas.openxmlformats.org/wordprocessingml/2006/main" w:ilvl="2">
+      <w:start w:val="1"/>
+      <w:numFmt w:val="bullet"/>
+      <w:lvlText w:val=""/>
+      <w:lvlJc w:val="left"/>
+      <w:pPr>
+        <w:ind w:left="2160" w:hanging="360"/>
+      </w:pPr>
+      <w:rPr>
+        <w:rFonts w:hint="default" w:ascii="Wingdings" w:hAnsi="Wingdings"/>
+      </w:rPr>
+    </w:lvl>
+    <w:lvl xmlns:w="http://schemas.openxmlformats.org/wordprocessingml/2006/main" w:ilvl="3">
+      <w:start w:val="1"/>
+      <w:numFmt w:val="bullet"/>
+      <w:lvlText w:val=""/>
+      <w:lvlJc w:val="left"/>
+      <w:pPr>
+        <w:ind w:left="2880" w:hanging="360"/>
+      </w:pPr>
+      <w:rPr>
+        <w:rFonts w:hint="default" w:ascii="Symbol" w:hAnsi="Symbol"/>
+      </w:rPr>
+    </w:lvl>
+    <w:lvl xmlns:w="http://schemas.openxmlformats.org/wordprocessingml/2006/main" w:ilvl="4">
+      <w:start w:val="1"/>
+      <w:numFmt w:val="bullet"/>
+      <w:lvlText w:val="o"/>
+      <w:lvlJc w:val="left"/>
+      <w:pPr>
+        <w:ind w:left="3600" w:hanging="360"/>
+      </w:pPr>
+      <w:rPr>
+        <w:rFonts w:hint="default" w:ascii="Courier New" w:hAnsi="Courier New"/>
+      </w:rPr>
+    </w:lvl>
+    <w:lvl xmlns:w="http://schemas.openxmlformats.org/wordprocessingml/2006/main" w:ilvl="5">
+      <w:start w:val="1"/>
+      <w:numFmt w:val="bullet"/>
+      <w:lvlText w:val=""/>
+      <w:lvlJc w:val="left"/>
+      <w:pPr>
+        <w:ind w:left="4320" w:hanging="360"/>
+      </w:pPr>
+      <w:rPr>
+        <w:rFonts w:hint="default" w:ascii="Wingdings" w:hAnsi="Wingdings"/>
+      </w:rPr>
+    </w:lvl>
+    <w:lvl xmlns:w="http://schemas.openxmlformats.org/wordprocessingml/2006/main" w:ilvl="6">
+      <w:start w:val="1"/>
+      <w:numFmt w:val="bullet"/>
+      <w:lvlText w:val=""/>
+      <w:lvlJc w:val="left"/>
+      <w:pPr>
+        <w:ind w:left="5040" w:hanging="360"/>
+      </w:pPr>
+      <w:rPr>
+        <w:rFonts w:hint="default" w:ascii="Symbol" w:hAnsi="Symbol"/>
+      </w:rPr>
+    </w:lvl>
+    <w:lvl xmlns:w="http://schemas.openxmlformats.org/wordprocessingml/2006/main" w:ilvl="7">
+      <w:start w:val="1"/>
+      <w:numFmt w:val="bullet"/>
+      <w:lvlText w:val="o"/>
+      <w:lvlJc w:val="left"/>
+      <w:pPr>
+        <w:ind w:left="5760" w:hanging="360"/>
+      </w:pPr>
+      <w:rPr>
+        <w:rFonts w:hint="default" w:ascii="Courier New" w:hAnsi="Courier New"/>
+      </w:rPr>
+    </w:lvl>
+    <w:lvl xmlns:w="http://schemas.openxmlformats.org/wordprocessingml/2006/main" w:ilvl="8">
+      <w:start w:val="1"/>
+      <w:numFmt w:val="bullet"/>
+      <w:lvlText w:val=""/>
+      <w:lvlJc w:val="left"/>
+      <w:pPr>
+        <w:ind w:left="6480" w:hanging="360"/>
+      </w:pPr>
+      <w:rPr>
+        <w:rFonts w:hint="default" w:ascii="Wingdings" w:hAnsi="Wingdings"/>
+      </w:rPr>
+    </w:lvl>
+  </w:abstractNum>
   <w:abstractNum w:abstractNumId="0" w15:restartNumberingAfterBreak="0">
     <w:nsid w:val="06226522"/>
     <w:multiLevelType w:val="hybridMultilevel"/>
@@ -32445,6 +32597,9 @@
       </w:rPr>
     </w:lvl>
   </w:abstractNum>
+  <w:num w:numId="43">
+    <w:abstractNumId w:val="42"/>
+  </w:num>
   <w:num w:numId="1">
     <w:abstractNumId w:val="30"/>
   </w:num>

</xml_diff>